<commit_message>
Recurring Scheduled Meetings Update
</commit_message>
<xml_diff>
--- a/docs/Z+ Technical Guide.docx
+++ b/docs/Z+ Technical Guide.docx
@@ -1435,6 +1435,95 @@
           </w:p>
         </w:tc>
       </w:tr>
+      <w:tr>
+        <w:tc>
+          <w:tcPr>
+            <w:tcW w:type="dxa" w:w="3100"/>
+            <w:tcBorders>
+              <w:top w:val="single" w:color="D0D5DD" w:sz="1"/>
+              <w:left w:val="single" w:color="D0D5DD" w:sz="1"/>
+              <w:bottom w:val="single" w:color="D0D5DD" w:sz="1"/>
+              <w:right w:val="single" w:color="D0D5DD" w:sz="1"/>
+            </w:tcBorders>
+            <w:tcMar>
+              <w:top w:type="dxa" w:w="55"/>
+              <w:left w:type="dxa" w:w="100"/>
+              <w:bottom w:type="dxa" w:w="55"/>
+              <w:right w:type="dxa" w:w="100"/>
+            </w:tcMar>
+          </w:tcPr>
+          <w:p>
+            <w:r>
+              <w:rPr>
+                <w:rFonts w:ascii="Arial" w:cs="Arial" w:eastAsia="Arial" w:hAnsi="Arial"/>
+                <w:b w:val="false"/>
+                <w:bCs w:val="false"/>
+                <w:sz w:val="19"/>
+                <w:szCs w:val="19"/>
+              </w:rPr>
+              <w:t xml:space="preserve">ZPLUS_INVITE_POLL_SECONDS</w:t>
+            </w:r>
+          </w:p>
+        </w:tc>
+        <w:tc>
+          <w:tcPr>
+            <w:tcW w:type="dxa" w:w="4260"/>
+            <w:tcBorders>
+              <w:top w:val="single" w:color="D0D5DD" w:sz="1"/>
+              <w:left w:val="single" w:color="D0D5DD" w:sz="1"/>
+              <w:bottom w:val="single" w:color="D0D5DD" w:sz="1"/>
+              <w:right w:val="single" w:color="D0D5DD" w:sz="1"/>
+            </w:tcBorders>
+            <w:tcMar>
+              <w:top w:type="dxa" w:w="55"/>
+              <w:left w:type="dxa" w:w="100"/>
+              <w:bottom w:type="dxa" w:w="55"/>
+              <w:right w:type="dxa" w:w="100"/>
+            </w:tcMar>
+          </w:tcPr>
+          <w:p>
+            <w:r>
+              <w:rPr>
+                <w:rFonts w:ascii="Arial" w:cs="Arial" w:eastAsia="Arial" w:hAnsi="Arial"/>
+                <w:b w:val="false"/>
+                <w:bCs w:val="false"/>
+                <w:sz w:val="19"/>
+                <w:szCs w:val="19"/>
+              </w:rPr>
+              <w:t xml:space="preserve">Reminder-invite dispatch interval</w:t>
+            </w:r>
+          </w:p>
+        </w:tc>
+        <w:tc>
+          <w:tcPr>
+            <w:tcW w:type="dxa" w:w="2000"/>
+            <w:tcBorders>
+              <w:top w:val="single" w:color="D0D5DD" w:sz="1"/>
+              <w:left w:val="single" w:color="D0D5DD" w:sz="1"/>
+              <w:bottom w:val="single" w:color="D0D5DD" w:sz="1"/>
+              <w:right w:val="single" w:color="D0D5DD" w:sz="1"/>
+            </w:tcBorders>
+            <w:tcMar>
+              <w:top w:type="dxa" w:w="55"/>
+              <w:left w:type="dxa" w:w="100"/>
+              <w:bottom w:type="dxa" w:w="55"/>
+              <w:right w:type="dxa" w:w="100"/>
+            </w:tcMar>
+          </w:tcPr>
+          <w:p>
+            <w:r>
+              <w:rPr>
+                <w:rFonts w:ascii="Arial" w:cs="Arial" w:eastAsia="Arial" w:hAnsi="Arial"/>
+                <w:b w:val="false"/>
+                <w:bCs w:val="false"/>
+                <w:sz w:val="19"/>
+                <w:szCs w:val="19"/>
+              </w:rPr>
+              <w:t xml:space="preserve">60 (min 15)</w:t>
+            </w:r>
+          </w:p>
+        </w:tc>
+      </w:tr>
     </w:tbl>
     <w:p>
       <w:pPr>
@@ -4793,6 +4882,118 @@
       </w:r>
       <w:r>
         <w:t xml:space="preserve"> button to verify configuration.</w:t>
+      </w:r>
+    </w:p>
+    <w:p>
+      <w:pPr>
+        <w:pStyle w:val="Heading3"/>
+      </w:pPr>
+      <w:r>
+        <w:t xml:space="preserve">Recurring meetings &amp; timed reminders</w:t>
+      </w:r>
+    </w:p>
+    <w:p>
+      <w:pPr>
+        <w:spacing w:after="120"/>
+      </w:pPr>
+      <w:r>
+        <w:t xml:space="preserve">A scheduled meeting can repeat (</w:t>
+      </w:r>
+      <w:r>
+        <w:rPr>
+          <w:rFonts w:ascii="Consolas" w:cs="Consolas" w:eastAsia="Consolas" w:hAnsi="Consolas"/>
+          <w:sz w:val="20"/>
+          <w:szCs w:val="20"/>
+        </w:rPr>
+        <w:t xml:space="preserve">RecurrencePattern</w:t>
+      </w:r>
+      <w:r>
+        <w:t xml:space="preserve"> = Daily / Weekly / Monthly, up to 52 </w:t>
+      </w:r>
+      <w:r>
+        <w:rPr>
+          <w:rFonts w:ascii="Consolas" w:cs="Consolas" w:eastAsia="Consolas" w:hAnsi="Consolas"/>
+          <w:sz w:val="20"/>
+          <w:szCs w:val="20"/>
+        </w:rPr>
+        <w:t xml:space="preserve">RecurrenceCount</w:t>
+      </w:r>
+      <w:r>
+        <w:t xml:space="preserve"> occurrences). Each occurrence is materialized as a separate </w:t>
+      </w:r>
+      <w:r>
+        <w:rPr>
+          <w:rFonts w:ascii="Consolas" w:cs="Consolas" w:eastAsia="Consolas" w:hAnsi="Consolas"/>
+          <w:sz w:val="20"/>
+          <w:szCs w:val="20"/>
+        </w:rPr>
+        <w:t xml:space="preserve">Meeting</w:t>
+      </w:r>
+      <w:r>
+        <w:t xml:space="preserve"> sharing a </w:t>
+      </w:r>
+      <w:r>
+        <w:rPr>
+          <w:rFonts w:ascii="Consolas" w:cs="Consolas" w:eastAsia="Consolas" w:hAnsi="Consolas"/>
+          <w:sz w:val="20"/>
+          <w:szCs w:val="20"/>
+        </w:rPr>
+        <w:t xml:space="preserve">SeriesId</w:t>
+      </w:r>
+      <w:r>
+        <w:t xml:space="preserve">, so each has its own join code and independent lifecycle.</w:t>
+      </w:r>
+    </w:p>
+    <w:p>
+      <w:pPr>
+        <w:spacing w:after="120"/>
+      </w:pPr>
+      <w:r>
+        <w:t xml:space="preserve">Invitations can be sent immediately or queued as reminders a chosen lead time before each occurrence (</w:t>
+      </w:r>
+      <w:r>
+        <w:rPr>
+          <w:rFonts w:ascii="Consolas" w:cs="Consolas" w:eastAsia="Consolas" w:hAnsi="Consolas"/>
+          <w:sz w:val="20"/>
+          <w:szCs w:val="20"/>
+        </w:rPr>
+        <w:t xml:space="preserve">ReminderLeadMinutes</w:t>
+      </w:r>
+      <w:r>
+        <w:t xml:space="preserve">). A hosted </w:t>
+      </w:r>
+      <w:r>
+        <w:rPr>
+          <w:rFonts w:ascii="Consolas" w:cs="Consolas" w:eastAsia="Consolas" w:hAnsi="Consolas"/>
+          <w:sz w:val="20"/>
+          <w:szCs w:val="20"/>
+        </w:rPr>
+        <w:t xml:space="preserve">InviteDispatcherService</w:t>
+      </w:r>
+      <w:r>
+        <w:t xml:space="preserve"> polls for due, unsent </w:t>
+      </w:r>
+      <w:r>
+        <w:rPr>
+          <w:rFonts w:ascii="Consolas" w:cs="Consolas" w:eastAsia="Consolas" w:hAnsi="Consolas"/>
+          <w:sz w:val="20"/>
+          <w:szCs w:val="20"/>
+        </w:rPr>
+        <w:t xml:space="preserve">MeetingInvitation</w:t>
+      </w:r>
+      <w:r>
+        <w:t xml:space="preserve"> rows (</w:t>
+      </w:r>
+      <w:r>
+        <w:rPr>
+          <w:rFonts w:ascii="Consolas" w:cs="Consolas" w:eastAsia="Consolas" w:hAnsi="Consolas"/>
+          <w:sz w:val="20"/>
+          <w:szCs w:val="20"/>
+        </w:rPr>
+        <w:t xml:space="preserve">SendAtUtc &lt;= now</w:t>
+      </w:r>
+      <w:r>
+        <w:t xml:space="preserve">) and emails them, backing off 15 minutes on failure. The meeting password is stored AES+HMAC-encrypted on the queued invitation so the reminder can include a one-click join link, and is cleared once the reminder is sent.</w:t>
       </w:r>
     </w:p>
     <w:p>

</xml_diff>

<commit_message>
reoccurring with end dates
</commit_message>
<xml_diff>
--- a/docs/Z+ Technical Guide.docx
+++ b/docs/Z+ Technical Guide.docx
@@ -4919,7 +4919,17 @@
         <w:t xml:space="preserve">RecurrenceCount</w:t>
       </w:r>
       <w:r>
-        <w:t xml:space="preserve"> occurrences). Each occurrence is materialized as a separate </w:t>
+        <w:t xml:space="preserve"> occurrences). The whole series is a </w:t>
+      </w:r>
+      <w:r>
+        <w:rPr>
+          <w:b/>
+          <w:bCs/>
+        </w:rPr>
+        <w:t xml:space="preserve">single</w:t>
+      </w:r>
+      <w:r>
+        <w:t xml:space="preserve"> </w:t>
       </w:r>
       <w:r>
         <w:rPr>
@@ -4930,18 +4940,61 @@
         <w:t xml:space="preserve">Meeting</w:t>
       </w:r>
       <w:r>
-        <w:t xml:space="preserve"> sharing a </w:t>
-      </w:r>
-      <w:r>
-        <w:rPr>
-          <w:rFonts w:ascii="Consolas" w:cs="Consolas" w:eastAsia="Consolas" w:hAnsi="Consolas"/>
-          <w:sz w:val="20"/>
-          <w:szCs w:val="20"/>
-        </w:rPr>
-        <w:t xml:space="preserve">SeriesId</w:t>
-      </w:r>
-      <w:r>
-        <w:t xml:space="preserve">, so each has its own join code and independent lifecycle.</w:t>
+        <w:t xml:space="preserve"> that carries the recurrence rule — the same </w:t>
+      </w:r>
+      <w:r>
+        <w:rPr>
+          <w:rFonts w:ascii="Consolas" w:cs="Consolas" w:eastAsia="Consolas" w:hAnsi="Consolas"/>
+          <w:sz w:val="20"/>
+          <w:szCs w:val="20"/>
+        </w:rPr>
+        <w:t xml:space="preserve">MeetingCode</w:t>
+      </w:r>
+      <w:r>
+        <w:t xml:space="preserve"> is reused for every occurrence (Zoom-style). Host </w:t>
+      </w:r>
+      <w:r>
+        <w:rPr>
+          <w:b/>
+          <w:bCs/>
+        </w:rPr>
+        <w:t xml:space="preserve">End for all</w:t>
+      </w:r>
+      <w:r>
+        <w:t xml:space="preserve"> ends the current occurrence (</w:t>
+      </w:r>
+      <w:r>
+        <w:rPr>
+          <w:rFonts w:ascii="Consolas" w:cs="Consolas" w:eastAsia="Consolas" w:hAnsi="Consolas"/>
+          <w:sz w:val="20"/>
+          <w:szCs w:val="20"/>
+        </w:rPr>
+        <w:t xml:space="preserve">IsActive</w:t>
+      </w:r>
+      <w:r>
+        <w:t xml:space="preserve"> → false) but leaves </w:t>
+      </w:r>
+      <w:r>
+        <w:rPr>
+          <w:rFonts w:ascii="Consolas" w:cs="Consolas" w:eastAsia="Consolas" w:hAnsi="Consolas"/>
+          <w:sz w:val="20"/>
+          <w:szCs w:val="20"/>
+        </w:rPr>
+        <w:t xml:space="preserve">EndedAtUtc</w:t>
+      </w:r>
+      <w:r>
+        <w:t xml:space="preserve"> null so the ID stays joinable next time; a one-off meeting ends permanently. (Admin force-end cancels the whole series.) The series' code auto-expires just after its last occurrence: </w:t>
+      </w:r>
+      <w:r>
+        <w:rPr>
+          <w:rFonts w:ascii="Consolas" w:cs="Consolas" w:eastAsia="Consolas" w:hAnsi="Consolas"/>
+          <w:sz w:val="20"/>
+          <w:szCs w:val="20"/>
+        </w:rPr>
+        <w:t xml:space="preserve">ExpiresAtUtc</w:t>
+      </w:r>
+      <w:r>
+        <w:t xml:space="preserve"> = last-occurrence start + duration + 2h grace is checked on join, lookup, the invite landing page, and the meetings list; one-off meetings never auto-expire.</w:t>
       </w:r>
     </w:p>
     <w:p>
@@ -4960,7 +5013,18 @@
         <w:t xml:space="preserve">ReminderLeadMinutes</w:t>
       </w:r>
       <w:r>
-        <w:t xml:space="preserve">). A hosted </w:t>
+        <w:t xml:space="preserve">). Reminders are queued per occurrence against the one meeting, each carrying its </w:t>
+      </w:r>
+      <w:r>
+        <w:rPr>
+          <w:rFonts w:ascii="Consolas" w:cs="Consolas" w:eastAsia="Consolas" w:hAnsi="Consolas"/>
+          <w:sz w:val="20"/>
+          <w:szCs w:val="20"/>
+        </w:rPr>
+        <w:t xml:space="preserve">OccurrenceStartUtc</w:t>
+      </w:r>
+      <w:r>
+        <w:t xml:space="preserve"> so the email shows the right date. A hosted </w:t>
       </w:r>
       <w:r>
         <w:rPr>

</xml_diff>